<commit_message>
Update v1/ links to reference yoshika-pkpd/tree/main/v1
Add manuscript source and reproduction code links in:
- Conclusions section
- Software availability section
- Both paper.md and generate_manuscript.py

Regenerate .docx and .pptx with updated links.

Co-Authored-By: Tatsuki Onishi <bougtoir@gmail.com>
</commit_message>
<xml_diff>
--- a/v1/output/yoshika_CMPB_Update_manuscript.docx
+++ b/v1/output/yoshika_CMPB_Update_manuscript.docx
@@ -2693,7 +2693,7 @@
     </w:p>
     <w:p>
       <w:r>
-        <w:t>The clinical significance of this approach is substantial: traditional mg/kg dose limits derived from IV pharmacokinetics do not account for the fundamentally different absorption kinetics of regional anesthesia. yoshika quantifies these differences and supports the development of evidence-based, route-specific dose guidelines. The software is freely available under the MIT license at https://github.com/bougtoir/yoshika-pkpd and can be installed via pip.</w:t>
+        <w:t>The clinical significance of this approach is substantial: traditional mg/kg dose limits derived from IV pharmacokinetics do not account for the fundamentally different absorption kinetics of regional anesthesia. yoshika quantifies these differences and supports the development of evidence-based, route-specific dose guidelines. The software is freely available under the MIT license at https://github.com/bougtoir/yoshika-pkpd and can be installed via pip. The manuscript source and reproduction code are available at https://github.com/bougtoir/yoshika-pkpd/tree/main/v1.</w:t>
       </w:r>
     </w:p>
     <w:p>
@@ -2706,7 +2706,7 @@
     </w:p>
     <w:p>
       <w:r>
-        <w:t>The source code for yoshika is publicly available at https://github.com/bougtoir/yoshika-pkpd under the MIT license. The package requires Python &gt;= 3.9 with NumPy, SciPy, Matplotlib, and Pandas as dependencies. Installation is available via pip install yoshika or from source. Documentation and usage examples are provided in the repository README.</w:t>
+        <w:t>The source code for yoshika is publicly available at https://github.com/bougtoir/yoshika-pkpd under the MIT license. The package requires Python &gt;= 3.9 with NumPy, SciPy, Matplotlib, and Pandas as dependencies. Installation is available via pip install yoshika or from source. Documentation and usage examples are provided in the repository README. The manuscript source, figures, and reproduction scripts are available at https://github.com/bougtoir/yoshika-pkpd/tree/main/v1.</w:t>
       </w:r>
     </w:p>
     <w:p>

</xml_diff>